<commit_message>
Done for not calculated in access ability
</commit_message>
<xml_diff>
--- a/Auditify_Parameter_Status.docx
+++ b/Auditify_Parameter_Status.docx
@@ -3766,17 +3766,17 @@
           <w:sz-cs w:val="19"/>
           <w:color w:val="000000"/>
         </w:rPr>
-        <w:t xml:space="preserve">❌</w:t>
-      </w:r>
-      <w:r>
-        <w:rPr>
-          <w:rFonts w:ascii="Times" w:hAnsi="Times" w:cs="Times"/>
-          <w:sz w:val="19"/>
-          <w:sz-cs w:val="19"/>
-          <w:b/>
-          <w:color w:val="000000"/>
-        </w:rPr>
-        <w:t xml:space="preserve"> Not calc.</w:t>
+        <w:t xml:space="preserve">✅</w:t>
+      </w:r>
+      <w:r>
+        <w:rPr>
+          <w:rFonts w:ascii="Times" w:hAnsi="Times" w:cs="Times"/>
+          <w:sz w:val="19"/>
+          <w:sz-cs w:val="19"/>
+          <w:b/>
+          <w:color w:val="000000"/>
+        </w:rPr>
+        <w:t xml:space="preserve"> Calculated</w:t>
       </w:r>
     </w:p>
     <w:p>
@@ -3815,17 +3815,17 @@
           <w:sz-cs w:val="19"/>
           <w:color w:val="000000"/>
         </w:rPr>
-        <w:t xml:space="preserve">❌</w:t>
-      </w:r>
-      <w:r>
-        <w:rPr>
-          <w:rFonts w:ascii="Times" w:hAnsi="Times" w:cs="Times"/>
-          <w:sz w:val="19"/>
-          <w:sz-cs w:val="19"/>
-          <w:b/>
-          <w:color w:val="000000"/>
-        </w:rPr>
-        <w:t xml:space="preserve"> Not calc.</w:t>
+        <w:t xml:space="preserve">✅</w:t>
+      </w:r>
+      <w:r>
+        <w:rPr>
+          <w:rFonts w:ascii="Times" w:hAnsi="Times" w:cs="Times"/>
+          <w:sz w:val="19"/>
+          <w:sz-cs w:val="19"/>
+          <w:b/>
+          <w:color w:val="000000"/>
+        </w:rPr>
+        <w:t xml:space="preserve"> Calculated</w:t>
       </w:r>
     </w:p>
     <w:p>
@@ -3864,17 +3864,17 @@
           <w:sz-cs w:val="19"/>
           <w:color w:val="000000"/>
         </w:rPr>
-        <w:t xml:space="preserve">❌</w:t>
-      </w:r>
-      <w:r>
-        <w:rPr>
-          <w:rFonts w:ascii="Times" w:hAnsi="Times" w:cs="Times"/>
-          <w:sz w:val="19"/>
-          <w:sz-cs w:val="19"/>
-          <w:b/>
-          <w:color w:val="000000"/>
-        </w:rPr>
-        <w:t xml:space="preserve"> Not calc.</w:t>
+        <w:t xml:space="preserve">✅</w:t>
+      </w:r>
+      <w:r>
+        <w:rPr>
+          <w:rFonts w:ascii="Times" w:hAnsi="Times" w:cs="Times"/>
+          <w:sz w:val="19"/>
+          <w:sz-cs w:val="19"/>
+          <w:b/>
+          <w:color w:val="000000"/>
+        </w:rPr>
+        <w:t xml:space="preserve"> Calculated</w:t>
       </w:r>
     </w:p>
     <w:p>
@@ -3913,17 +3913,17 @@
           <w:sz-cs w:val="19"/>
           <w:color w:val="000000"/>
         </w:rPr>
-        <w:t xml:space="preserve">❌</w:t>
-      </w:r>
-      <w:r>
-        <w:rPr>
-          <w:rFonts w:ascii="Times" w:hAnsi="Times" w:cs="Times"/>
-          <w:sz w:val="19"/>
-          <w:sz-cs w:val="19"/>
-          <w:b/>
-          <w:color w:val="000000"/>
-        </w:rPr>
-        <w:t xml:space="preserve"> Not calc.</w:t>
+        <w:t xml:space="preserve">✅</w:t>
+      </w:r>
+      <w:r>
+        <w:rPr>
+          <w:rFonts w:ascii="Times" w:hAnsi="Times" w:cs="Times"/>
+          <w:sz w:val="19"/>
+          <w:sz-cs w:val="19"/>
+          <w:b/>
+          <w:color w:val="000000"/>
+        </w:rPr>
+        <w:t xml:space="preserve"> Calculated</w:t>
       </w:r>
     </w:p>
     <w:p>
@@ -3962,17 +3962,17 @@
           <w:sz-cs w:val="19"/>
           <w:color w:val="000000"/>
         </w:rPr>
-        <w:t xml:space="preserve">❌</w:t>
-      </w:r>
-      <w:r>
-        <w:rPr>
-          <w:rFonts w:ascii="Times" w:hAnsi="Times" w:cs="Times"/>
-          <w:sz w:val="19"/>
-          <w:sz-cs w:val="19"/>
-          <w:b/>
-          <w:color w:val="000000"/>
-        </w:rPr>
-        <w:t xml:space="preserve"> Not calc.</w:t>
+        <w:t xml:space="preserve">✅</w:t>
+      </w:r>
+      <w:r>
+        <w:rPr>
+          <w:rFonts w:ascii="Times" w:hAnsi="Times" w:cs="Times"/>
+          <w:sz w:val="19"/>
+          <w:sz-cs w:val="19"/>
+          <w:b/>
+          <w:color w:val="000000"/>
+        </w:rPr>
+        <w:t xml:space="preserve"> Calculated</w:t>
       </w:r>
     </w:p>
     <w:p>
@@ -4011,17 +4011,17 @@
           <w:sz-cs w:val="19"/>
           <w:color w:val="000000"/>
         </w:rPr>
-        <w:t xml:space="preserve">❌</w:t>
-      </w:r>
-      <w:r>
-        <w:rPr>
-          <w:rFonts w:ascii="Times" w:hAnsi="Times" w:cs="Times"/>
-          <w:sz w:val="19"/>
-          <w:sz-cs w:val="19"/>
-          <w:b/>
-          <w:color w:val="000000"/>
-        </w:rPr>
-        <w:t xml:space="preserve"> Not calc.</w:t>
+        <w:t xml:space="preserve">✅</w:t>
+      </w:r>
+      <w:r>
+        <w:rPr>
+          <w:rFonts w:ascii="Times" w:hAnsi="Times" w:cs="Times"/>
+          <w:sz w:val="19"/>
+          <w:sz-cs w:val="19"/>
+          <w:b/>
+          <w:color w:val="000000"/>
+        </w:rPr>
+        <w:t xml:space="preserve"> Calculated</w:t>
       </w:r>
     </w:p>
     <w:p>
@@ -4060,17 +4060,17 @@
           <w:sz-cs w:val="19"/>
           <w:color w:val="000000"/>
         </w:rPr>
-        <w:t xml:space="preserve">❌</w:t>
-      </w:r>
-      <w:r>
-        <w:rPr>
-          <w:rFonts w:ascii="Times" w:hAnsi="Times" w:cs="Times"/>
-          <w:sz w:val="19"/>
-          <w:sz-cs w:val="19"/>
-          <w:b/>
-          <w:color w:val="000000"/>
-        </w:rPr>
-        <w:t xml:space="preserve"> Not calc.</w:t>
+        <w:t xml:space="preserve">✅</w:t>
+      </w:r>
+      <w:r>
+        <w:rPr>
+          <w:rFonts w:ascii="Times" w:hAnsi="Times" w:cs="Times"/>
+          <w:sz w:val="19"/>
+          <w:sz-cs w:val="19"/>
+          <w:b/>
+          <w:color w:val="000000"/>
+        </w:rPr>
+        <w:t xml:space="preserve"> Calculated</w:t>
       </w:r>
     </w:p>
     <w:p>
@@ -4109,17 +4109,17 @@
           <w:sz-cs w:val="19"/>
           <w:color w:val="000000"/>
         </w:rPr>
-        <w:t xml:space="preserve">❌</w:t>
-      </w:r>
-      <w:r>
-        <w:rPr>
-          <w:rFonts w:ascii="Times" w:hAnsi="Times" w:cs="Times"/>
-          <w:sz w:val="19"/>
-          <w:sz-cs w:val="19"/>
-          <w:b/>
-          <w:color w:val="000000"/>
-        </w:rPr>
-        <w:t xml:space="preserve"> Not calc.</w:t>
+        <w:t xml:space="preserve">✅</w:t>
+      </w:r>
+      <w:r>
+        <w:rPr>
+          <w:rFonts w:ascii="Times" w:hAnsi="Times" w:cs="Times"/>
+          <w:sz w:val="19"/>
+          <w:sz-cs w:val="19"/>
+          <w:b/>
+          <w:color w:val="000000"/>
+        </w:rPr>
+        <w:t xml:space="preserve"> Calculated</w:t>
       </w:r>
     </w:p>
     <w:p>
@@ -4742,17 +4742,17 @@
           <w:sz-cs w:val="19"/>
           <w:color w:val="000000"/>
         </w:rPr>
-        <w:t xml:space="preserve">❌</w:t>
-      </w:r>
-      <w:r>
-        <w:rPr>
-          <w:rFonts w:ascii="Times" w:hAnsi="Times" w:cs="Times"/>
-          <w:sz w:val="19"/>
-          <w:sz-cs w:val="19"/>
-          <w:b/>
-          <w:color w:val="000000"/>
-        </w:rPr>
-        <w:t xml:space="preserve"> Not calc.</w:t>
+        <w:t xml:space="preserve">✅</w:t>
+      </w:r>
+      <w:r>
+        <w:rPr>
+          <w:rFonts w:ascii="Times" w:hAnsi="Times" w:cs="Times"/>
+          <w:sz w:val="19"/>
+          <w:sz-cs w:val="19"/>
+          <w:b/>
+          <w:color w:val="000000"/>
+        </w:rPr>
+        <w:t xml:space="preserve"> Calculated</w:t>
       </w:r>
     </w:p>
     <w:p>

</xml_diff>

<commit_message>
DOCX add for seo
</commit_message>
<xml_diff>
--- a/Auditify_Parameter_Status.docx
+++ b/Auditify_Parameter_Status.docx
@@ -388,31 +388,22 @@
           <w:b/>
           <w:color w:val="BF8F00"/>
         </w:rPr>
-        <w:t xml:space="preserve"> 8   </w:t>
-      </w:r>
-      <w:r>
-        <w:rPr>
-          <w:rFonts w:ascii="Apple Color Emoji" w:hAnsi="Apple Color Emoji" w:cs="Apple Color Emoji"/>
-          <w:sz w:val="19"/>
-          <w:sz-cs w:val="19"/>
+        <w:t xml:space="preserve"> 8  </w:t>
+      </w:r>
+      <w:r>
+        <w:rPr>
+          <w:rFonts w:ascii="Times" w:hAnsi="Times" w:cs="Times"/>
+          <w:sz w:val="19"/>
+          <w:sz-cs w:val="19"/>
+          <w:b/>
           <w:color w:val="C00000"/>
         </w:rPr>
-        <w:t xml:space="preserve">❌</w:t>
-      </w:r>
-      <w:r>
-        <w:rPr>
-          <w:rFonts w:ascii="Times" w:hAnsi="Times" w:cs="Times"/>
-          <w:sz w:val="19"/>
-          <w:sz-cs w:val="19"/>
-          <w:b/>
-          <w:color w:val="C00000"/>
-        </w:rPr>
-        <w:t xml:space="preserve"> 4</w:t>
-      </w:r>
-    </w:p>
-    <w:p>
-      <w:pPr>
-        <w:spacing w:before="160" w:after="60"/>
+        <w:t xml:space="preserve"/>
+      </w:r>
+    </w:p>
+    <w:p>
+      <w:pPr>
+        <w:spacing w:after="120"/>
       </w:pPr>
       <w:r>
         <w:rPr>
@@ -4199,22 +4190,13 @@
       </w:r>
       <w:r>
         <w:rPr>
-          <w:rFonts w:ascii="Apple Color Emoji" w:hAnsi="Apple Color Emoji" w:cs="Apple Color Emoji"/>
-          <w:sz w:val="19"/>
-          <w:sz-cs w:val="19"/>
+          <w:rFonts w:ascii="Times" w:hAnsi="Times" w:cs="Times"/>
+          <w:sz w:val="19"/>
+          <w:sz-cs w:val="19"/>
+          <w:b/>
           <w:color w:val="C00000"/>
         </w:rPr>
-        <w:t xml:space="preserve">❌</w:t>
-      </w:r>
-      <w:r>
-        <w:rPr>
-          <w:rFonts w:ascii="Times" w:hAnsi="Times" w:cs="Times"/>
-          <w:sz w:val="19"/>
-          <w:sz-cs w:val="19"/>
-          <w:b/>
-          <w:color w:val="C00000"/>
-        </w:rPr>
-        <w:t xml:space="preserve"> 1</w:t>
+        <w:t xml:space="preserve"/>
       </w:r>
     </w:p>
     <w:p>
@@ -11309,17 +11291,17 @@
           <w:sz-cs w:val="19"/>
           <w:color w:val="000000"/>
         </w:rPr>
-        <w:t xml:space="preserve">❌</w:t>
-      </w:r>
-      <w:r>
-        <w:rPr>
-          <w:rFonts w:ascii="Times" w:hAnsi="Times" w:cs="Times"/>
-          <w:sz w:val="19"/>
-          <w:sz-cs w:val="19"/>
-          <w:b/>
-          <w:color w:val="000000"/>
-        </w:rPr>
-        <w:t xml:space="preserve"> Not calc.</w:t>
+        <w:t xml:space="preserve">✅</w:t>
+      </w:r>
+      <w:r>
+        <w:rPr>
+          <w:rFonts w:ascii="Times" w:hAnsi="Times" w:cs="Times"/>
+          <w:sz w:val="19"/>
+          <w:sz-cs w:val="19"/>
+          <w:b/>
+          <w:color w:val="000000"/>
+        </w:rPr>
+        <w:t xml:space="preserve"> Calculated</w:t>
       </w:r>
     </w:p>
     <w:p>
@@ -11358,17 +11340,17 @@
           <w:sz-cs w:val="19"/>
           <w:color w:val="000000"/>
         </w:rPr>
-        <w:t xml:space="preserve">❌</w:t>
-      </w:r>
-      <w:r>
-        <w:rPr>
-          <w:rFonts w:ascii="Times" w:hAnsi="Times" w:cs="Times"/>
-          <w:sz w:val="19"/>
-          <w:sz-cs w:val="19"/>
-          <w:b/>
-          <w:color w:val="000000"/>
-        </w:rPr>
-        <w:t xml:space="preserve"> Not calc.</w:t>
+        <w:t xml:space="preserve">✅</w:t>
+      </w:r>
+      <w:r>
+        <w:rPr>
+          <w:rFonts w:ascii="Times" w:hAnsi="Times" w:cs="Times"/>
+          <w:sz w:val="19"/>
+          <w:sz-cs w:val="19"/>
+          <w:b/>
+          <w:color w:val="000000"/>
+        </w:rPr>
+        <w:t xml:space="preserve"> Calculated</w:t>
       </w:r>
     </w:p>
     <w:p>
@@ -11707,17 +11689,17 @@
           <w:sz-cs w:val="19"/>
           <w:color w:val="000000"/>
         </w:rPr>
-        <w:t xml:space="preserve">❌</w:t>
-      </w:r>
-      <w:r>
-        <w:rPr>
-          <w:rFonts w:ascii="Times" w:hAnsi="Times" w:cs="Times"/>
-          <w:sz w:val="19"/>
-          <w:sz-cs w:val="19"/>
-          <w:b/>
-          <w:color w:val="000000"/>
-        </w:rPr>
-        <w:t xml:space="preserve"> Not calc.</w:t>
+        <w:t xml:space="preserve">✅</w:t>
+      </w:r>
+      <w:r>
+        <w:rPr>
+          <w:rFonts w:ascii="Times" w:hAnsi="Times" w:cs="Times"/>
+          <w:sz w:val="19"/>
+          <w:sz-cs w:val="19"/>
+          <w:b/>
+          <w:color w:val="000000"/>
+        </w:rPr>
+        <w:t xml:space="preserve"> Calculated</w:t>
       </w:r>
     </w:p>
     <w:p>
@@ -12056,17 +12038,17 @@
           <w:sz-cs w:val="19"/>
           <w:color w:val="000000"/>
         </w:rPr>
-        <w:t xml:space="preserve">❌</w:t>
-      </w:r>
-      <w:r>
-        <w:rPr>
-          <w:rFonts w:ascii="Times" w:hAnsi="Times" w:cs="Times"/>
-          <w:sz w:val="19"/>
-          <w:sz-cs w:val="19"/>
-          <w:b/>
-          <w:color w:val="000000"/>
-        </w:rPr>
-        <w:t xml:space="preserve"> Not calc.</w:t>
+        <w:t xml:space="preserve">✅</w:t>
+      </w:r>
+      <w:r>
+        <w:rPr>
+          <w:rFonts w:ascii="Times" w:hAnsi="Times" w:cs="Times"/>
+          <w:sz w:val="19"/>
+          <w:sz-cs w:val="19"/>
+          <w:b/>
+          <w:color w:val="000000"/>
+        </w:rPr>
+        <w:t xml:space="preserve"> Calculated</w:t>
       </w:r>
     </w:p>
     <w:p>
@@ -12105,17 +12087,17 @@
           <w:sz-cs w:val="19"/>
           <w:color w:val="000000"/>
         </w:rPr>
-        <w:t xml:space="preserve">❌</w:t>
-      </w:r>
-      <w:r>
-        <w:rPr>
-          <w:rFonts w:ascii="Times" w:hAnsi="Times" w:cs="Times"/>
-          <w:sz w:val="19"/>
-          <w:sz-cs w:val="19"/>
-          <w:b/>
-          <w:color w:val="000000"/>
-        </w:rPr>
-        <w:t xml:space="preserve"> Not calc.</w:t>
+        <w:t xml:space="preserve">✅</w:t>
+      </w:r>
+      <w:r>
+        <w:rPr>
+          <w:rFonts w:ascii="Times" w:hAnsi="Times" w:cs="Times"/>
+          <w:sz w:val="19"/>
+          <w:sz-cs w:val="19"/>
+          <w:b/>
+          <w:color w:val="000000"/>
+        </w:rPr>
+        <w:t xml:space="preserve"> Calculated</w:t>
       </w:r>
     </w:p>
     <w:p>
@@ -12154,17 +12136,17 @@
           <w:sz-cs w:val="19"/>
           <w:color w:val="000000"/>
         </w:rPr>
-        <w:t xml:space="preserve">❌</w:t>
-      </w:r>
-      <w:r>
-        <w:rPr>
-          <w:rFonts w:ascii="Times" w:hAnsi="Times" w:cs="Times"/>
-          <w:sz w:val="19"/>
-          <w:sz-cs w:val="19"/>
-          <w:b/>
-          <w:color w:val="000000"/>
-        </w:rPr>
-        <w:t xml:space="preserve"> Not calc.</w:t>
+        <w:t xml:space="preserve">✅</w:t>
+      </w:r>
+      <w:r>
+        <w:rPr>
+          <w:rFonts w:ascii="Times" w:hAnsi="Times" w:cs="Times"/>
+          <w:sz w:val="19"/>
+          <w:sz-cs w:val="19"/>
+          <w:b/>
+          <w:color w:val="000000"/>
+        </w:rPr>
+        <w:t xml:space="preserve"> Calculated</w:t>
       </w:r>
     </w:p>
     <w:p>

</xml_diff>